<commit_message>
Fix accents in documentation
Co-authored-by: Copilot <223556219+Copilot@users.noreply.github.com>
</commit_message>
<xml_diff>
--- a/docs/Documentacion_tecnica_Olwe.docx
+++ b/docs/Documentacion_tecnica_Olwe.docx
@@ -20,12 +20,7 @@
         <w:jc w:val="center"/>
       </w:pPr>
       <w:r>
-        <w:rPr>
-          <w:b/>
-          <w:color w:val="1F3864"/>
-          <w:sz w:val="44"/>
-        </w:rPr>
-        <w:t>Documentaci?n t?cnica</w:t>
+        <w:t>Documentación técnica</w:t>
       </w:r>
     </w:p>
     <w:p>
@@ -38,7 +33,7 @@
           <w:color w:val="595959"/>
           <w:sz w:val="22"/>
         </w:rPr>
-        <w:t>Instalaci?n, arquitectura y mantenimiento del prototipo Olwe</w:t>
+        <w:t>Instalación, arquitectura y mantenimiento del prototipo Olwe</w:t>
       </w:r>
     </w:p>
     <w:p/>
@@ -52,7 +47,7 @@
     </w:p>
     <w:p>
       <w:r>
-        <w:t>Olwe es una aplicaci?n web frontend desarrollada como prototipo de un portal universitario. La aplicaci?n implementa una pantalla de acceso, navegaci?n lateral, vista de exploraci?n con mapa simulado, consulta de planes, filtros y modales visuales.</w:t>
+        <w:t>Olwe es una aplicación web frontend desarrollada como prototipo de un portal universitario. La aplicación implementa una pantalla de acceso, navegación lateral, vista de exploración con mapa simulado, consulta de planes, filtros y modales visuales.</w:t>
       </w:r>
     </w:p>
     <w:p>
@@ -60,7 +55,7 @@
         <w:pStyle w:val="Heading1"/>
       </w:pPr>
       <w:r>
-        <w:t>2. Tecnolog?as</w:t>
+        <w:t>2. Tecnologías</w:t>
       </w:r>
     </w:p>
     <w:tbl>
@@ -89,7 +84,7 @@
                 <w:color w:val="FFFFFF"/>
                 <w:sz w:val="18"/>
               </w:rPr>
-              <w:t>Tecnolog?a</w:t>
+              <w:t>Tecnología</w:t>
             </w:r>
           </w:p>
         </w:tc>
@@ -141,7 +136,7 @@
                 <w:b w:val="0"/>
                 <w:sz w:val="18"/>
               </w:rPr>
-              <w:t>Construcci?n de componentes y manejo de estado.</w:t>
+              <w:t>Construcción de componentes y manejo de estado.</w:t>
             </w:r>
           </w:p>
         </w:tc>
@@ -175,7 +170,7 @@
                 <w:b w:val="0"/>
                 <w:sz w:val="18"/>
               </w:rPr>
-              <w:t>Servidor de desarrollo y proceso de compilaci?n.</w:t>
+              <w:t>Servidor de desarrollo y proceso de compilación.</w:t>
             </w:r>
           </w:p>
         </w:tc>
@@ -237,13 +232,8 @@
             <w:vAlign w:val="center"/>
           </w:tcPr>
           <w:p>
-            <w:r/>
             <w:r>
-              <w:rPr>
-                <w:b w:val="0"/>
-                <w:sz w:val="18"/>
-              </w:rPr>
-              <w:t>Componente principal y l?gica del login.</w:t>
+              <w:t>Componente principal y lógica del login.</w:t>
             </w:r>
           </w:p>
         </w:tc>
@@ -277,7 +267,7 @@
                 <w:b w:val="0"/>
                 <w:sz w:val="18"/>
               </w:rPr>
-              <w:t>Dise?o visual, responsive y layout.</w:t>
+              <w:t>Diseño visual, responsive y layout.</w:t>
             </w:r>
           </w:p>
         </w:tc>
@@ -305,13 +295,8 @@
             <w:vAlign w:val="center"/>
           </w:tcPr>
           <w:p>
-            <w:r/>
             <w:r>
-              <w:rPr>
-                <w:b w:val="0"/>
-                <w:sz w:val="18"/>
-              </w:rPr>
-              <w:t>Revisi?n est?tica del c?digo.</w:t>
+              <w:t>Revisión est?tica del c?digo.</w:t>
             </w:r>
           </w:p>
         </w:tc>
@@ -345,7 +330,7 @@
                 <w:b w:val="0"/>
                 <w:sz w:val="18"/>
               </w:rPr>
-              <w:t>Dependencia/configuraci?n disponible en el proyecto.</w:t>
+              <w:t>Dependencia/configuración disponible en el proyecto.</w:t>
             </w:r>
           </w:p>
         </w:tc>
@@ -397,7 +382,7 @@
         <w:pStyle w:val="Heading1"/>
       </w:pPr>
       <w:r>
-        <w:t>4. Instalaci?n local</w:t>
+        <w:t>4. Instalación local</w:t>
       </w:r>
     </w:p>
     <w:p>
@@ -485,14 +470,8 @@
             <w:shd w:fill="2F5496"/>
           </w:tcPr>
           <w:p>
-            <w:r/>
             <w:r>
-              <w:rPr>
-                <w:b/>
-                <w:color w:val="FFFFFF"/>
-                <w:sz w:val="18"/>
-              </w:rPr>
-              <w:t>Funci?n</w:t>
+              <w:t>Función</w:t>
             </w:r>
           </w:p>
         </w:tc>
@@ -554,13 +533,8 @@
             <w:vAlign w:val="center"/>
           </w:tcPr>
           <w:p>
-            <w:r/>
             <w:r>
-              <w:rPr>
-                <w:b w:val="0"/>
-                <w:sz w:val="18"/>
-              </w:rPr>
-              <w:t>Genera la compilaci?n de producci?n en dist/.</w:t>
+              <w:t>Genera la compilación de producci?n en dist/.</w:t>
             </w:r>
           </w:p>
         </w:tc>
@@ -622,13 +596,8 @@
             <w:vAlign w:val="center"/>
           </w:tcPr>
           <w:p>
-            <w:r/>
             <w:r>
-              <w:rPr>
-                <w:b w:val="0"/>
-                <w:sz w:val="18"/>
-              </w:rPr>
-              <w:t>Sirve localmente la compilaci?n de producci?n.</w:t>
+              <w:t>Sirve localmente la compilación de producci?n.</w:t>
             </w:r>
           </w:p>
         </w:tc>
@@ -721,7 +690,7 @@
                 <w:b w:val="0"/>
                 <w:sz w:val="18"/>
               </w:rPr>
-              <w:t>Login, validaciones y transici?n a la aplicaci?n.</w:t>
+              <w:t>Login, validaciones y transición a la aplicación.</w:t>
             </w:r>
           </w:p>
         </w:tc>
@@ -891,7 +860,7 @@
                 <w:b w:val="0"/>
                 <w:sz w:val="18"/>
               </w:rPr>
-              <w:t>Detalle y edici?n visual del plan.</w:t>
+              <w:t>Detalle y edición visual del plan.</w:t>
             </w:r>
           </w:p>
         </w:tc>
@@ -959,7 +928,7 @@
                 <w:b w:val="0"/>
                 <w:sz w:val="18"/>
               </w:rPr>
-              <w:t>Tipos de datos de planes y categor?as.</w:t>
+              <w:t>Tipos de datos de planes y categorías.</w:t>
             </w:r>
           </w:p>
         </w:tc>
@@ -993,7 +962,7 @@
                 <w:b w:val="0"/>
                 <w:sz w:val="18"/>
               </w:rPr>
-              <w:t>Estilos de login, navegaci?n, vistas, modales y responsive.</w:t>
+              <w:t>Estilos de login, navegación, vistas, modales y responsive.</w:t>
             </w:r>
           </w:p>
         </w:tc>
@@ -1055,13 +1024,8 @@
             <w:vAlign w:val="center"/>
           </w:tcPr>
           <w:p>
-            <w:r/>
             <w:r>
-              <w:rPr>
-                <w:b w:val="0"/>
-                <w:sz w:val="18"/>
-              </w:rPr>
-              <w:t>Fotograf?as, logotipos e im?genes de la interfaz.</w:t>
+              <w:t>Fotografías, logotipos e imágenes de la interfaz.</w:t>
             </w:r>
           </w:p>
         </w:tc>
@@ -1073,12 +1037,12 @@
         <w:pStyle w:val="Heading1"/>
       </w:pPr>
       <w:r>
-        <w:t>7. Flujo de autenticaci?n</w:t>
+        <w:t>7. Flujo de autenticación</w:t>
       </w:r>
     </w:p>
     <w:p>
       <w:r>
-        <w:t>El estado isLoggedIn controla la transici?n entre el login y ExploreView. La funci?n getEmailStatus valida el dominio institucional. handleSubmit valida campos, simula una espera de carga de 1.8 segundos y compara las credenciales de demostraci?n.</w:t>
+        <w:t>El estado isLoggedIn controla la transición entre el login y ExploreView. La función getEmailStatus valida el dominio institucional. handleSubmit valida campos, simula una espera de carga de 1.8 segundos y compara las credenciales de demostración.</w:t>
       </w:r>
     </w:p>
     <w:p>
@@ -1094,7 +1058,7 @@
         <w:pStyle w:val="ListBullet"/>
       </w:pPr>
       <w:r>
-        <w:t>Credenciales de demostraci?n: usuario@unison.mx / 123456.</w:t>
+        <w:t>Credenciales de demostración: usuario@unison.mx / 123456.</w:t>
       </w:r>
     </w:p>
     <w:p>
@@ -1102,7 +1066,7 @@
         <w:pStyle w:val="ListBullet"/>
       </w:pPr>
       <w:r>
-        <w:t>No existe autenticaci?n real, tokens, sesiones persistentes ni conexi?n a backend.</w:t>
+        <w:t>No existe autenticación real, tokens, sesiones persistentes ni conexión a backend.</w:t>
       </w:r>
     </w:p>
     <w:p>
@@ -1115,7 +1079,7 @@
     </w:p>
     <w:p>
       <w:r>
-        <w:t>ExploreView mantiene el estado de la secci?n activa, los filtros, el modal de creaci?n y el plan seleccionado. filteredPlanes se calcula con useMemo y combina coincidencia de texto, categor?a, visibilidad y estado.</w:t>
+        <w:t>ExploreView mantiene el estado de la sección activa, los filtros, el modal de creación y el plan seleccionado. filteredPlanes se calcula con useMemo y combina coincidencia de texto, categoría, visibilidad y estado.</w:t>
       </w:r>
     </w:p>
     <w:p>
@@ -1139,7 +1103,7 @@
         <w:pStyle w:val="ListBullet"/>
       </w:pPr>
       <w:r>
-        <w:t>En m?vil se oculta la imagen lateral y el formulario pasa a una sola columna.</w:t>
+        <w:t>En móvil se oculta la imagen lateral y el formulario pasa a una sola columna.</w:t>
       </w:r>
     </w:p>
     <w:p>
@@ -1147,7 +1111,7 @@
         <w:pStyle w:val="ListBullet"/>
       </w:pPr>
       <w:r>
-        <w:t>La sidebar y los controles de b?squeda reducen su tama?o en pantallas peque?as.</w:t>
+        <w:t>La sidebar y los controles de búsqueda reducen su tamaño en pantallas peque?as.</w:t>
       </w:r>
     </w:p>
     <w:p>
@@ -1171,7 +1135,7 @@
         <w:pStyle w:val="Heading1"/>
       </w:pPr>
       <w:r>
-        <w:t>10. Verificaci?n actual</w:t>
+        <w:t>10. Verificación actual</w:t>
       </w:r>
     </w:p>
     <w:tbl>
@@ -1200,7 +1164,7 @@
                 <w:color w:val="FFFFFF"/>
                 <w:sz w:val="18"/>
               </w:rPr>
-              <w:t>Verificaci?n</w:t>
+              <w:t>Verificación</w:t>
             </w:r>
           </w:p>
         </w:tc>
@@ -1246,13 +1210,8 @@
             <w:vAlign w:val="center"/>
           </w:tcPr>
           <w:p>
-            <w:r/>
             <w:r>
-              <w:rPr>
-                <w:b w:val="0"/>
-                <w:sz w:val="18"/>
-              </w:rPr>
-              <w:t>Correcto; compilaci?n de producci?n generada.</w:t>
+              <w:t>Correcto; compilación de producci?n generada.</w:t>
             </w:r>
           </w:p>
         </w:tc>
@@ -1366,12 +1325,12 @@
         <w:pStyle w:val="Heading1"/>
       </w:pPr>
       <w:r>
-        <w:t>11. Publicaci?n temporal con Cloudflare Tunnel</w:t>
+        <w:t>11. Publicación temporal con Cloudflare Tunnel</w:t>
       </w:r>
     </w:p>
     <w:p>
       <w:r>
-        <w:t>Para compartir el servidor local temporalmente se puede utilizar cloudflared apuntando al puerto de Vite. La configuraci?n de Vite incluye allowedHosts: true para aceptar el host externo del t?nel. Un Quick Tunnel es temporal y solo funciona mientras permanecen activos Vite y cloudflared.</w:t>
+        <w:t>Para compartir el servidor local temporalmente se puede utilizar cloudflared apuntando al puerto de Vite. La configuración de Vite incluye allowedHosts: true para aceptar el host externo del túnel. Un Quick Tunnel es temporal y solo funciona mientras permanecen activos Vite y cloudflared.</w:t>
       </w:r>
     </w:p>
     <w:p>
@@ -1387,7 +1346,7 @@
         <w:pStyle w:val="ListBullet"/>
       </w:pPr>
       <w:r>
-        <w:t>Conectar autenticaci?n real y recuperaci?n de contrase?a.</w:t>
+        <w:t>Conectar autenticación real y recuperaci?n de contraseña.</w:t>
       </w:r>
     </w:p>
     <w:p>

</xml_diff>

<commit_message>
Normalize accented documentation text
Co-authored-by: Copilot <223556219+Copilot@users.noreply.github.com>
</commit_message>
<xml_diff>
--- a/docs/Documentacion_tecnica_Olwe.docx
+++ b/docs/Documentacion_tecnica_Olwe.docx
@@ -296,7 +296,7 @@
           </w:tcPr>
           <w:p>
             <w:r>
-              <w:t>Revisión est?tica del c?digo.</w:t>
+              <w:t>Revisión estática del código.</w:t>
             </w:r>
           </w:p>
         </w:tc>
@@ -534,7 +534,7 @@
           </w:tcPr>
           <w:p>
             <w:r>
-              <w:t>Genera la compilación de producci?n en dist/.</w:t>
+              <w:t>Genera la compilación de producción en dist/.</w:t>
             </w:r>
           </w:p>
         </w:tc>
@@ -597,7 +597,7 @@
           </w:tcPr>
           <w:p>
             <w:r>
-              <w:t>Sirve localmente la compilación de producci?n.</w:t>
+              <w:t>Sirve localmente la compilación de producción.</w:t>
             </w:r>
           </w:p>
         </w:tc>
@@ -1111,7 +1111,7 @@
         <w:pStyle w:val="ListBullet"/>
       </w:pPr>
       <w:r>
-        <w:t>La sidebar y los controles de búsqueda reducen su tamaño en pantallas peque?as.</w:t>
+        <w:t>La sidebar y los controles de búsqueda reducen su tamaño en pantallas pequeñas.</w:t>
       </w:r>
     </w:p>
     <w:p>
@@ -1211,7 +1211,7 @@
           </w:tcPr>
           <w:p>
             <w:r>
-              <w:t>Correcto; compilación de producci?n generada.</w:t>
+              <w:t>Correcto; compilación de producción generada.</w:t>
             </w:r>
           </w:p>
         </w:tc>
@@ -1346,7 +1346,7 @@
         <w:pStyle w:val="ListBullet"/>
       </w:pPr>
       <w:r>
-        <w:t>Conectar autenticación real y recuperaci?n de contraseña.</w:t>
+        <w:t>Conectar autenticación real y recuperación de contraseña.</w:t>
       </w:r>
     </w:p>
     <w:p>

</xml_diff>

<commit_message>
Replace project documentation files
Co-authored-by: Copilot <223556219+Copilot@users.noreply.github.com>
</commit_message>
<xml_diff>
--- a/docs/Documentacion_tecnica_Olwe.docx
+++ b/docs/Documentacion_tecnica_Olwe.docx
@@ -4,39 +4,19 @@
   <w:body>
     <w:p>
       <w:pPr>
-        <w:jc w:val="center"/>
+        <w:pStyle w:val="Title"/>
       </w:pPr>
       <w:r>
-        <w:rPr>
-          <w:b/>
-          <w:color w:val="2F5496"/>
-          <w:sz w:val="60"/>
-        </w:rPr>
         <w:t>OLWE</w:t>
-      </w:r>
-    </w:p>
-    <w:p>
-      <w:pPr>
-        <w:jc w:val="center"/>
-      </w:pPr>
-      <w:r>
+        <w:br/>
         <w:t>Documentación técnica</w:t>
       </w:r>
     </w:p>
     <w:p>
-      <w:pPr>
-        <w:jc w:val="center"/>
-      </w:pPr>
       <w:r>
-        <w:rPr>
-          <w:i/>
-          <w:color w:val="595959"/>
-          <w:sz w:val="22"/>
-        </w:rPr>
         <w:t>Instalación, arquitectura y mantenimiento del prototipo Olwe</w:t>
       </w:r>
     </w:p>
-    <w:p/>
     <w:p>
       <w:pPr>
         <w:pStyle w:val="Heading1"/>
@@ -58,285 +38,23 @@
         <w:t>2. Tecnologías</w:t>
       </w:r>
     </w:p>
-    <w:tbl>
-      <w:tblPr>
-        <w:tblStyle w:val="TableGrid"/>
-        <w:tblW w:type="auto" w:w="0"/>
-        <w:jc w:val="center"/>
-        <w:tblLook w:firstColumn="1" w:firstRow="1" w:lastColumn="0" w:lastRow="0" w:noHBand="0" w:noVBand="1" w:val="04A0"/>
-      </w:tblPr>
-      <w:tblGrid>
-        <w:gridCol w:w="4968"/>
-        <w:gridCol w:w="4968"/>
-      </w:tblGrid>
-      <w:tr>
-        <w:tc>
-          <w:tcPr>
-            <w:tcW w:type="dxa" w:w="4968"/>
-            <w:vAlign w:val="center"/>
-            <w:shd w:fill="2F5496"/>
-          </w:tcPr>
-          <w:p>
-            <w:r/>
-            <w:r>
-              <w:rPr>
-                <w:b/>
-                <w:color w:val="FFFFFF"/>
-                <w:sz w:val="18"/>
-              </w:rPr>
-              <w:t>Tecnología</w:t>
-            </w:r>
-          </w:p>
-        </w:tc>
-        <w:tc>
-          <w:tcPr>
-            <w:tcW w:type="dxa" w:w="4968"/>
-            <w:vAlign w:val="center"/>
-            <w:shd w:fill="2F5496"/>
-          </w:tcPr>
-          <w:p>
-            <w:r/>
-            <w:r>
-              <w:rPr>
-                <w:b/>
-                <w:color w:val="FFFFFF"/>
-                <w:sz w:val="18"/>
-              </w:rPr>
-              <w:t>Uso</w:t>
-            </w:r>
-          </w:p>
-        </w:tc>
-      </w:tr>
-      <w:tr>
-        <w:tc>
-          <w:tcPr>
-            <w:tcW w:type="dxa" w:w="4968"/>
-            <w:vAlign w:val="center"/>
-          </w:tcPr>
-          <w:p>
-            <w:r/>
-            <w:r>
-              <w:rPr>
-                <w:b w:val="0"/>
-                <w:sz w:val="18"/>
-              </w:rPr>
-              <w:t>React 19</w:t>
-            </w:r>
-          </w:p>
-        </w:tc>
-        <w:tc>
-          <w:tcPr>
-            <w:tcW w:type="dxa" w:w="4968"/>
-            <w:vAlign w:val="center"/>
-          </w:tcPr>
-          <w:p>
-            <w:r/>
-            <w:r>
-              <w:rPr>
-                <w:b w:val="0"/>
-                <w:sz w:val="18"/>
-              </w:rPr>
-              <w:t>Construcción de componentes y manejo de estado.</w:t>
-            </w:r>
-          </w:p>
-        </w:tc>
-      </w:tr>
-      <w:tr>
-        <w:tc>
-          <w:tcPr>
-            <w:tcW w:type="dxa" w:w="4968"/>
-            <w:vAlign w:val="center"/>
-          </w:tcPr>
-          <w:p>
-            <w:r/>
-            <w:r>
-              <w:rPr>
-                <w:b w:val="0"/>
-                <w:sz w:val="18"/>
-              </w:rPr>
-              <w:t>Vite 8</w:t>
-            </w:r>
-          </w:p>
-        </w:tc>
-        <w:tc>
-          <w:tcPr>
-            <w:tcW w:type="dxa" w:w="4968"/>
-            <w:vAlign w:val="center"/>
-          </w:tcPr>
-          <w:p>
-            <w:r/>
-            <w:r>
-              <w:rPr>
-                <w:b w:val="0"/>
-                <w:sz w:val="18"/>
-              </w:rPr>
-              <w:t>Servidor de desarrollo y proceso de compilación.</w:t>
-            </w:r>
-          </w:p>
-        </w:tc>
-      </w:tr>
-      <w:tr>
-        <w:tc>
-          <w:tcPr>
-            <w:tcW w:type="dxa" w:w="4968"/>
-            <w:vAlign w:val="center"/>
-          </w:tcPr>
-          <w:p>
-            <w:r/>
-            <w:r>
-              <w:rPr>
-                <w:b w:val="0"/>
-                <w:sz w:val="18"/>
-              </w:rPr>
-              <w:t>TypeScript/TSX</w:t>
-            </w:r>
-          </w:p>
-        </w:tc>
-        <w:tc>
-          <w:tcPr>
-            <w:tcW w:type="dxa" w:w="4968"/>
-            <w:vAlign w:val="center"/>
-          </w:tcPr>
-          <w:p>
-            <w:r/>
-            <w:r>
-              <w:rPr>
-                <w:b w:val="0"/>
-                <w:sz w:val="18"/>
-              </w:rPr>
-              <w:t>Tipado de componentes y datos de planes.</w:t>
-            </w:r>
-          </w:p>
-        </w:tc>
-      </w:tr>
-      <w:tr>
-        <w:tc>
-          <w:tcPr>
-            <w:tcW w:type="dxa" w:w="4968"/>
-            <w:vAlign w:val="center"/>
-          </w:tcPr>
-          <w:p>
-            <w:r/>
-            <w:r>
-              <w:rPr>
-                <w:b w:val="0"/>
-                <w:sz w:val="18"/>
-              </w:rPr>
-              <w:t>JavaScript/JSX</w:t>
-            </w:r>
-          </w:p>
-        </w:tc>
-        <w:tc>
-          <w:tcPr>
-            <w:tcW w:type="dxa" w:w="4968"/>
-            <w:vAlign w:val="center"/>
-          </w:tcPr>
-          <w:p>
-            <w:r>
-              <w:t>Componente principal y lógica del login.</w:t>
-            </w:r>
-          </w:p>
-        </w:tc>
-      </w:tr>
-      <w:tr>
-        <w:tc>
-          <w:tcPr>
-            <w:tcW w:type="dxa" w:w="4968"/>
-            <w:vAlign w:val="center"/>
-          </w:tcPr>
-          <w:p>
-            <w:r/>
-            <w:r>
-              <w:rPr>
-                <w:b w:val="0"/>
-                <w:sz w:val="18"/>
-              </w:rPr>
-              <w:t>CSS</w:t>
-            </w:r>
-          </w:p>
-        </w:tc>
-        <w:tc>
-          <w:tcPr>
-            <w:tcW w:type="dxa" w:w="4968"/>
-            <w:vAlign w:val="center"/>
-          </w:tcPr>
-          <w:p>
-            <w:r/>
-            <w:r>
-              <w:rPr>
-                <w:b w:val="0"/>
-                <w:sz w:val="18"/>
-              </w:rPr>
-              <w:t>Diseño visual, responsive y layout.</w:t>
-            </w:r>
-          </w:p>
-        </w:tc>
-      </w:tr>
-      <w:tr>
-        <w:tc>
-          <w:tcPr>
-            <w:tcW w:type="dxa" w:w="4968"/>
-            <w:vAlign w:val="center"/>
-          </w:tcPr>
-          <w:p>
-            <w:r/>
-            <w:r>
-              <w:rPr>
-                <w:b w:val="0"/>
-                <w:sz w:val="18"/>
-              </w:rPr>
-              <w:t>ESLint</w:t>
-            </w:r>
-          </w:p>
-        </w:tc>
-        <w:tc>
-          <w:tcPr>
-            <w:tcW w:type="dxa" w:w="4968"/>
-            <w:vAlign w:val="center"/>
-          </w:tcPr>
-          <w:p>
-            <w:r>
-              <w:t>Revisión estática del código.</w:t>
-            </w:r>
-          </w:p>
-        </w:tc>
-      </w:tr>
-      <w:tr>
-        <w:tc>
-          <w:tcPr>
-            <w:tcW w:type="dxa" w:w="4968"/>
-            <w:vAlign w:val="center"/>
-          </w:tcPr>
-          <w:p>
-            <w:r/>
-            <w:r>
-              <w:rPr>
-                <w:b w:val="0"/>
-                <w:sz w:val="18"/>
-              </w:rPr>
-              <w:t>Tailwind CSS</w:t>
-            </w:r>
-          </w:p>
-        </w:tc>
-        <w:tc>
-          <w:tcPr>
-            <w:tcW w:type="dxa" w:w="4968"/>
-            <w:vAlign w:val="center"/>
-          </w:tcPr>
-          <w:p>
-            <w:r/>
-            <w:r>
-              <w:rPr>
-                <w:b w:val="0"/>
-                <w:sz w:val="18"/>
-              </w:rPr>
-              <w:t>Dependencia/configuración disponible en el proyecto.</w:t>
-            </w:r>
-          </w:p>
-        </w:tc>
-      </w:tr>
-    </w:tbl>
-    <w:p/>
+    <w:p>
+      <w:r>
+        <w:t>- React 19: Construcción de componentes y manejo de estado.</w:t>
+        <w:br/>
+        <w:t>- Vite 8: Servidor de desarrollo y proceso de compilación.</w:t>
+        <w:br/>
+        <w:t>- TypeScript/TSX: Tipado de componentes y datos de planes.</w:t>
+        <w:br/>
+        <w:t>- JavaScript/JSX: Componente principal y lógica del login.</w:t>
+        <w:br/>
+        <w:t>- CSS: Diseño visual, responsive y layout.</w:t>
+        <w:br/>
+        <w:t>- ESLint: Revisión estática del código.</w:t>
+        <w:br/>
+        <w:t>- Tailwind CSS: Dependencia/configuración disponible en el proyecto.</w:t>
+      </w:r>
+    </w:p>
     <w:p>
       <w:pPr>
         <w:pStyle w:val="Heading1"/>
@@ -346,35 +64,14 @@
       </w:r>
     </w:p>
     <w:p>
-      <w:pPr>
-        <w:pStyle w:val="ListBullet"/>
-      </w:pPr>
       <w:r>
-        <w:t>Node.js y npm instalados.</w:t>
-      </w:r>
-    </w:p>
-    <w:p>
-      <w:pPr>
-        <w:pStyle w:val="ListBullet"/>
-      </w:pPr>
-      <w:r>
-        <w:t>Git para control de versiones.</w:t>
-      </w:r>
-    </w:p>
-    <w:p>
-      <w:pPr>
-        <w:pStyle w:val="ListBullet"/>
-      </w:pPr>
-      <w:r>
-        <w:t>Navegador moderno.</w:t>
-      </w:r>
-    </w:p>
-    <w:p>
-      <w:pPr>
-        <w:pStyle w:val="ListBullet"/>
-      </w:pPr>
-      <w:r>
-        <w:t>Sistema operativo Windows, macOS o Linux.</w:t>
+        <w:t>- Node.js y npm instalados.</w:t>
+        <w:br/>
+        <w:t>- Git para control de versiones.</w:t>
+        <w:br/>
+        <w:t>- Navegador moderno.</w:t>
+        <w:br/>
+        <w:t>- Sistema operativo Windows, macOS o Linux.</w:t>
       </w:r>
     </w:p>
     <w:p>
@@ -386,43 +83,16 @@
       </w:r>
     </w:p>
     <w:p>
-      <w:pPr>
-        <w:pStyle w:val="ListNumber"/>
-      </w:pPr>
       <w:r>
-        <w:t>Clona el repositorio: git clone https://github.com/Sapitoequisde/Olwe_prototipo.git</w:t>
-      </w:r>
-    </w:p>
-    <w:p>
-      <w:pPr>
-        <w:pStyle w:val="ListNumber"/>
-      </w:pPr>
-      <w:r>
-        <w:t>Entra a la carpeta: cd Olwe_prototipo</w:t>
-      </w:r>
-    </w:p>
-    <w:p>
-      <w:pPr>
-        <w:pStyle w:val="ListNumber"/>
-      </w:pPr>
-      <w:r>
-        <w:t>Instala dependencias: npm install</w:t>
-      </w:r>
-    </w:p>
-    <w:p>
-      <w:pPr>
-        <w:pStyle w:val="ListNumber"/>
-      </w:pPr>
-      <w:r>
-        <w:t>Inicia el servidor: npm run dev</w:t>
-      </w:r>
-    </w:p>
-    <w:p>
-      <w:pPr>
-        <w:pStyle w:val="ListNumber"/>
-      </w:pPr>
-      <w:r>
-        <w:t>Abre la URL local mostrada por Vite, normalmente http://localhost:5173.</w:t>
+        <w:t>- Clona el repositorio: git clone https://github.com/Sapitoequisde/Olwe_prototipo.git</w:t>
+        <w:br/>
+        <w:t>- Entra a la carpeta: cd Olwe_prototipo</w:t>
+        <w:br/>
+        <w:t>- Instala dependencias: npm install</w:t>
+        <w:br/>
+        <w:t>- Inicia el servidor: npm run dev</w:t>
+        <w:br/>
+        <w:t>- Abre la URL local mostrada por Vite, normalmente http://localhost:5173.</w:t>
       </w:r>
     </w:p>
     <w:p>
@@ -433,177 +103,17 @@
         <w:t>5. Scripts disponibles</w:t>
       </w:r>
     </w:p>
-    <w:tbl>
-      <w:tblPr>
-        <w:tblStyle w:val="TableGrid"/>
-        <w:tblW w:type="auto" w:w="0"/>
-        <w:jc w:val="center"/>
-        <w:tblLook w:firstColumn="1" w:firstRow="1" w:lastColumn="0" w:lastRow="0" w:noHBand="0" w:noVBand="1" w:val="04A0"/>
-      </w:tblPr>
-      <w:tblGrid>
-        <w:gridCol w:w="4968"/>
-        <w:gridCol w:w="4968"/>
-      </w:tblGrid>
-      <w:tr>
-        <w:tc>
-          <w:tcPr>
-            <w:tcW w:type="dxa" w:w="4968"/>
-            <w:vAlign w:val="center"/>
-            <w:shd w:fill="2F5496"/>
-          </w:tcPr>
-          <w:p>
-            <w:r/>
-            <w:r>
-              <w:rPr>
-                <w:b/>
-                <w:color w:val="FFFFFF"/>
-                <w:sz w:val="18"/>
-              </w:rPr>
-              <w:t>Comando</w:t>
-            </w:r>
-          </w:p>
-        </w:tc>
-        <w:tc>
-          <w:tcPr>
-            <w:tcW w:type="dxa" w:w="4968"/>
-            <w:vAlign w:val="center"/>
-            <w:shd w:fill="2F5496"/>
-          </w:tcPr>
-          <w:p>
-            <w:r>
-              <w:t>Función</w:t>
-            </w:r>
-          </w:p>
-        </w:tc>
-      </w:tr>
-      <w:tr>
-        <w:tc>
-          <w:tcPr>
-            <w:tcW w:type="dxa" w:w="4968"/>
-            <w:vAlign w:val="center"/>
-          </w:tcPr>
-          <w:p>
-            <w:r/>
-            <w:r>
-              <w:rPr>
-                <w:b w:val="0"/>
-                <w:sz w:val="18"/>
-              </w:rPr>
-              <w:t>npm run dev</w:t>
-            </w:r>
-          </w:p>
-        </w:tc>
-        <w:tc>
-          <w:tcPr>
-            <w:tcW w:type="dxa" w:w="4968"/>
-            <w:vAlign w:val="center"/>
-          </w:tcPr>
-          <w:p>
-            <w:r/>
-            <w:r>
-              <w:rPr>
-                <w:b w:val="0"/>
-                <w:sz w:val="18"/>
-              </w:rPr>
-              <w:t>Inicia el servidor de desarrollo con recarga en caliente.</w:t>
-            </w:r>
-          </w:p>
-        </w:tc>
-      </w:tr>
-      <w:tr>
-        <w:tc>
-          <w:tcPr>
-            <w:tcW w:type="dxa" w:w="4968"/>
-            <w:vAlign w:val="center"/>
-          </w:tcPr>
-          <w:p>
-            <w:r/>
-            <w:r>
-              <w:rPr>
-                <w:b w:val="0"/>
-                <w:sz w:val="18"/>
-              </w:rPr>
-              <w:t>npm run build</w:t>
-            </w:r>
-          </w:p>
-        </w:tc>
-        <w:tc>
-          <w:tcPr>
-            <w:tcW w:type="dxa" w:w="4968"/>
-            <w:vAlign w:val="center"/>
-          </w:tcPr>
-          <w:p>
-            <w:r>
-              <w:t>Genera la compilación de producción en dist/.</w:t>
-            </w:r>
-          </w:p>
-        </w:tc>
-      </w:tr>
-      <w:tr>
-        <w:tc>
-          <w:tcPr>
-            <w:tcW w:type="dxa" w:w="4968"/>
-            <w:vAlign w:val="center"/>
-          </w:tcPr>
-          <w:p>
-            <w:r/>
-            <w:r>
-              <w:rPr>
-                <w:b w:val="0"/>
-                <w:sz w:val="18"/>
-              </w:rPr>
-              <w:t>npm run lint</w:t>
-            </w:r>
-          </w:p>
-        </w:tc>
-        <w:tc>
-          <w:tcPr>
-            <w:tcW w:type="dxa" w:w="4968"/>
-            <w:vAlign w:val="center"/>
-          </w:tcPr>
-          <w:p>
-            <w:r/>
-            <w:r>
-              <w:rPr>
-                <w:b w:val="0"/>
-                <w:sz w:val="18"/>
-              </w:rPr>
-              <w:t>Ejecuta ESLint sobre el proyecto.</w:t>
-            </w:r>
-          </w:p>
-        </w:tc>
-      </w:tr>
-      <w:tr>
-        <w:tc>
-          <w:tcPr>
-            <w:tcW w:type="dxa" w:w="4968"/>
-            <w:vAlign w:val="center"/>
-          </w:tcPr>
-          <w:p>
-            <w:r/>
-            <w:r>
-              <w:rPr>
-                <w:b w:val="0"/>
-                <w:sz w:val="18"/>
-              </w:rPr>
-              <w:t>npm run preview</w:t>
-            </w:r>
-          </w:p>
-        </w:tc>
-        <w:tc>
-          <w:tcPr>
-            <w:tcW w:type="dxa" w:w="4968"/>
-            <w:vAlign w:val="center"/>
-          </w:tcPr>
-          <w:p>
-            <w:r>
-              <w:t>Sirve localmente la compilación de producción.</w:t>
-            </w:r>
-          </w:p>
-        </w:tc>
-      </w:tr>
-    </w:tbl>
-    <w:p/>
+    <w:p>
+      <w:r>
+        <w:t>- npm run dev: Inicia el servidor de desarrollo con recarga en caliente.</w:t>
+        <w:br/>
+        <w:t>- npm run build: Genera la compilación de producción en dist/.</w:t>
+        <w:br/>
+        <w:t>- npm run lint: Ejecuta ESLint sobre el proyecto.</w:t>
+        <w:br/>
+        <w:t>- npm run preview: Sirve localmente la compilación de producción.</w:t>
+      </w:r>
+    </w:p>
     <w:p>
       <w:pPr>
         <w:pStyle w:val="Heading1"/>
@@ -612,426 +122,31 @@
         <w:t>6. Estructura principal</w:t>
       </w:r>
     </w:p>
-    <w:tbl>
-      <w:tblPr>
-        <w:tblStyle w:val="TableGrid"/>
-        <w:tblW w:type="auto" w:w="0"/>
-        <w:jc w:val="center"/>
-        <w:tblLook w:firstColumn="1" w:firstRow="1" w:lastColumn="0" w:lastRow="0" w:noHBand="0" w:noVBand="1" w:val="04A0"/>
-      </w:tblPr>
-      <w:tblGrid>
-        <w:gridCol w:w="4968"/>
-        <w:gridCol w:w="4968"/>
-      </w:tblGrid>
-      <w:tr>
-        <w:tc>
-          <w:tcPr>
-            <w:tcW w:type="dxa" w:w="4968"/>
-            <w:vAlign w:val="center"/>
-            <w:shd w:fill="2F5496"/>
-          </w:tcPr>
-          <w:p>
-            <w:r/>
-            <w:r>
-              <w:rPr>
-                <w:b/>
-                <w:color w:val="FFFFFF"/>
-                <w:sz w:val="18"/>
-              </w:rPr>
-              <w:t>Ruta</w:t>
-            </w:r>
-          </w:p>
-        </w:tc>
-        <w:tc>
-          <w:tcPr>
-            <w:tcW w:type="dxa" w:w="4968"/>
-            <w:vAlign w:val="center"/>
-            <w:shd w:fill="2F5496"/>
-          </w:tcPr>
-          <w:p>
-            <w:r/>
-            <w:r>
-              <w:rPr>
-                <w:b/>
-                <w:color w:val="FFFFFF"/>
-                <w:sz w:val="18"/>
-              </w:rPr>
-              <w:t>Responsabilidad</w:t>
-            </w:r>
-          </w:p>
-        </w:tc>
-      </w:tr>
-      <w:tr>
-        <w:tc>
-          <w:tcPr>
-            <w:tcW w:type="dxa" w:w="4968"/>
-            <w:vAlign w:val="center"/>
-          </w:tcPr>
-          <w:p>
-            <w:r/>
-            <w:r>
-              <w:rPr>
-                <w:b w:val="0"/>
-                <w:sz w:val="18"/>
-              </w:rPr>
-              <w:t>src/App.jsx</w:t>
-            </w:r>
-          </w:p>
-        </w:tc>
-        <w:tc>
-          <w:tcPr>
-            <w:tcW w:type="dxa" w:w="4968"/>
-            <w:vAlign w:val="center"/>
-          </w:tcPr>
-          <w:p>
-            <w:r/>
-            <w:r>
-              <w:rPr>
-                <w:b w:val="0"/>
-                <w:sz w:val="18"/>
-              </w:rPr>
-              <w:t>Login, validaciones y transición a la aplicación.</w:t>
-            </w:r>
-          </w:p>
-        </w:tc>
-      </w:tr>
-      <w:tr>
-        <w:tc>
-          <w:tcPr>
-            <w:tcW w:type="dxa" w:w="4968"/>
-            <w:vAlign w:val="center"/>
-          </w:tcPr>
-          <w:p>
-            <w:r/>
-            <w:r>
-              <w:rPr>
-                <w:b w:val="0"/>
-                <w:sz w:val="18"/>
-              </w:rPr>
-              <w:t>src/pages/ExploreView.tsx</w:t>
-            </w:r>
-          </w:p>
-        </w:tc>
-        <w:tc>
-          <w:tcPr>
-            <w:tcW w:type="dxa" w:w="4968"/>
-            <w:vAlign w:val="center"/>
-          </w:tcPr>
-          <w:p>
-            <w:r/>
-            <w:r>
-              <w:rPr>
-                <w:b w:val="0"/>
-                <w:sz w:val="18"/>
-              </w:rPr>
-              <w:t>Sidebar, Explorar, Mis planes, filtros y modales.</w:t>
-            </w:r>
-          </w:p>
-        </w:tc>
-      </w:tr>
-      <w:tr>
-        <w:tc>
-          <w:tcPr>
-            <w:tcW w:type="dxa" w:w="4968"/>
-            <w:vAlign w:val="center"/>
-          </w:tcPr>
-          <w:p>
-            <w:r/>
-            <w:r>
-              <w:rPr>
-                <w:b w:val="0"/>
-                <w:sz w:val="18"/>
-              </w:rPr>
-              <w:t>src/components/FilterBar.tsx</w:t>
-            </w:r>
-          </w:p>
-        </w:tc>
-        <w:tc>
-          <w:tcPr>
-            <w:tcW w:type="dxa" w:w="4968"/>
-            <w:vAlign w:val="center"/>
-          </w:tcPr>
-          <w:p>
-            <w:r/>
-            <w:r>
-              <w:rPr>
-                <w:b w:val="0"/>
-                <w:sz w:val="18"/>
-              </w:rPr>
-              <w:t>Buscador y controles de filtrado.</w:t>
-            </w:r>
-          </w:p>
-        </w:tc>
-      </w:tr>
-      <w:tr>
-        <w:tc>
-          <w:tcPr>
-            <w:tcW w:type="dxa" w:w="4968"/>
-            <w:vAlign w:val="center"/>
-          </w:tcPr>
-          <w:p>
-            <w:r/>
-            <w:r>
-              <w:rPr>
-                <w:b w:val="0"/>
-                <w:sz w:val="18"/>
-              </w:rPr>
-              <w:t>src/components/MapBackground.tsx</w:t>
-            </w:r>
-          </w:p>
-        </w:tc>
-        <w:tc>
-          <w:tcPr>
-            <w:tcW w:type="dxa" w:w="4968"/>
-            <w:vAlign w:val="center"/>
-          </w:tcPr>
-          <w:p>
-            <w:r/>
-            <w:r>
-              <w:rPr>
-                <w:b w:val="0"/>
-                <w:sz w:val="18"/>
-              </w:rPr>
-              <w:t>Mapa visual simulado.</w:t>
-            </w:r>
-          </w:p>
-        </w:tc>
-      </w:tr>
-      <w:tr>
-        <w:tc>
-          <w:tcPr>
-            <w:tcW w:type="dxa" w:w="4968"/>
-            <w:vAlign w:val="center"/>
-          </w:tcPr>
-          <w:p>
-            <w:r/>
-            <w:r>
-              <w:rPr>
-                <w:b w:val="0"/>
-                <w:sz w:val="18"/>
-              </w:rPr>
-              <w:t>src/components/PlanMarker.tsx</w:t>
-            </w:r>
-          </w:p>
-        </w:tc>
-        <w:tc>
-          <w:tcPr>
-            <w:tcW w:type="dxa" w:w="4968"/>
-            <w:vAlign w:val="center"/>
-          </w:tcPr>
-          <w:p>
-            <w:r/>
-            <w:r>
-              <w:rPr>
-                <w:b w:val="0"/>
-                <w:sz w:val="18"/>
-              </w:rPr>
-              <w:t>Marcadores interactivos del mapa.</w:t>
-            </w:r>
-          </w:p>
-        </w:tc>
-      </w:tr>
-      <w:tr>
-        <w:tc>
-          <w:tcPr>
-            <w:tcW w:type="dxa" w:w="4968"/>
-            <w:vAlign w:val="center"/>
-          </w:tcPr>
-          <w:p>
-            <w:r/>
-            <w:r>
-              <w:rPr>
-                <w:b w:val="0"/>
-                <w:sz w:val="18"/>
-              </w:rPr>
-              <w:t>src/components/PlanDetailModal.tsx</w:t>
-            </w:r>
-          </w:p>
-        </w:tc>
-        <w:tc>
-          <w:tcPr>
-            <w:tcW w:type="dxa" w:w="4968"/>
-            <w:vAlign w:val="center"/>
-          </w:tcPr>
-          <w:p>
-            <w:r/>
-            <w:r>
-              <w:rPr>
-                <w:b w:val="0"/>
-                <w:sz w:val="18"/>
-              </w:rPr>
-              <w:t>Detalle y edición visual del plan.</w:t>
-            </w:r>
-          </w:p>
-        </w:tc>
-      </w:tr>
-      <w:tr>
-        <w:tc>
-          <w:tcPr>
-            <w:tcW w:type="dxa" w:w="4968"/>
-            <w:vAlign w:val="center"/>
-          </w:tcPr>
-          <w:p>
-            <w:r/>
-            <w:r>
-              <w:rPr>
-                <w:b w:val="0"/>
-                <w:sz w:val="18"/>
-              </w:rPr>
-              <w:t>src/data/mockData.ts</w:t>
-            </w:r>
-          </w:p>
-        </w:tc>
-        <w:tc>
-          <w:tcPr>
-            <w:tcW w:type="dxa" w:w="4968"/>
-            <w:vAlign w:val="center"/>
-          </w:tcPr>
-          <w:p>
-            <w:r/>
-            <w:r>
-              <w:rPr>
-                <w:b w:val="0"/>
-                <w:sz w:val="18"/>
-              </w:rPr>
-              <w:t>Planes de ejemplo.</w:t>
-            </w:r>
-          </w:p>
-        </w:tc>
-      </w:tr>
-      <w:tr>
-        <w:tc>
-          <w:tcPr>
-            <w:tcW w:type="dxa" w:w="4968"/>
-            <w:vAlign w:val="center"/>
-          </w:tcPr>
-          <w:p>
-            <w:r/>
-            <w:r>
-              <w:rPr>
-                <w:b w:val="0"/>
-                <w:sz w:val="18"/>
-              </w:rPr>
-              <w:t>src/types.ts</w:t>
-            </w:r>
-          </w:p>
-        </w:tc>
-        <w:tc>
-          <w:tcPr>
-            <w:tcW w:type="dxa" w:w="4968"/>
-            <w:vAlign w:val="center"/>
-          </w:tcPr>
-          <w:p>
-            <w:r/>
-            <w:r>
-              <w:rPr>
-                <w:b w:val="0"/>
-                <w:sz w:val="18"/>
-              </w:rPr>
-              <w:t>Tipos de datos de planes y categorías.</w:t>
-            </w:r>
-          </w:p>
-        </w:tc>
-      </w:tr>
-      <w:tr>
-        <w:tc>
-          <w:tcPr>
-            <w:tcW w:type="dxa" w:w="4968"/>
-            <w:vAlign w:val="center"/>
-          </w:tcPr>
-          <w:p>
-            <w:r/>
-            <w:r>
-              <w:rPr>
-                <w:b w:val="0"/>
-                <w:sz w:val="18"/>
-              </w:rPr>
-              <w:t>src/App.css</w:t>
-            </w:r>
-          </w:p>
-        </w:tc>
-        <w:tc>
-          <w:tcPr>
-            <w:tcW w:type="dxa" w:w="4968"/>
-            <w:vAlign w:val="center"/>
-          </w:tcPr>
-          <w:p>
-            <w:r/>
-            <w:r>
-              <w:rPr>
-                <w:b w:val="0"/>
-                <w:sz w:val="18"/>
-              </w:rPr>
-              <w:t>Estilos de login, navegación, vistas, modales y responsive.</w:t>
-            </w:r>
-          </w:p>
-        </w:tc>
-      </w:tr>
-      <w:tr>
-        <w:tc>
-          <w:tcPr>
-            <w:tcW w:type="dxa" w:w="4968"/>
-            <w:vAlign w:val="center"/>
-          </w:tcPr>
-          <w:p>
-            <w:r/>
-            <w:r>
-              <w:rPr>
-                <w:b w:val="0"/>
-                <w:sz w:val="18"/>
-              </w:rPr>
-              <w:t>src/index.css</w:t>
-            </w:r>
-          </w:p>
-        </w:tc>
-        <w:tc>
-          <w:tcPr>
-            <w:tcW w:type="dxa" w:w="4968"/>
-            <w:vAlign w:val="center"/>
-          </w:tcPr>
-          <w:p>
-            <w:r/>
-            <w:r>
-              <w:rPr>
-                <w:b w:val="0"/>
-                <w:sz w:val="18"/>
-              </w:rPr>
-              <w:t>Estilos globales y reset.</w:t>
-            </w:r>
-          </w:p>
-        </w:tc>
-      </w:tr>
-      <w:tr>
-        <w:tc>
-          <w:tcPr>
-            <w:tcW w:type="dxa" w:w="4968"/>
-            <w:vAlign w:val="center"/>
-          </w:tcPr>
-          <w:p>
-            <w:r/>
-            <w:r>
-              <w:rPr>
-                <w:b w:val="0"/>
-                <w:sz w:val="18"/>
-              </w:rPr>
-              <w:t>src/assets/</w:t>
-            </w:r>
-          </w:p>
-        </w:tc>
-        <w:tc>
-          <w:tcPr>
-            <w:tcW w:type="dxa" w:w="4968"/>
-            <w:vAlign w:val="center"/>
-          </w:tcPr>
-          <w:p>
-            <w:r>
-              <w:t>Fotografías, logotipos e imágenes de la interfaz.</w:t>
-            </w:r>
-          </w:p>
-        </w:tc>
-      </w:tr>
-    </w:tbl>
-    <w:p/>
+    <w:p>
+      <w:r>
+        <w:t>- src/App.jsx: Login, validaciones y transición a la aplicación.</w:t>
+        <w:br/>
+        <w:t>- src/pages/ExploreView.tsx: Sidebar, Explorar, Mis planes, filtros y modales.</w:t>
+        <w:br/>
+        <w:t>- src/components/FilterBar.tsx: Buscador y controles de filtrado.</w:t>
+        <w:br/>
+        <w:t>- src/components/MapBackground.tsx: Mapa visual simulado.</w:t>
+        <w:br/>
+        <w:t>- src/components/PlanMarker.tsx: Marcadores interactivos del mapa.</w:t>
+        <w:br/>
+        <w:t>- src/components/PlanDetailModal.tsx: Detalle y edición visual del plan.</w:t>
+        <w:br/>
+        <w:t>- src/data/mockData.ts: Planes de ejemplo.</w:t>
+        <w:br/>
+        <w:t>- src/types.ts: Tipos de datos de planes y categorías.</w:t>
+        <w:br/>
+        <w:t>- src/App.css: Estilos de login, navegación, vistas, modales y responsive.</w:t>
+        <w:br/>
+        <w:t>- src/index.css: Estilos globales y reset.</w:t>
+        <w:br/>
+        <w:t>- src/assets/: Fotografías, logotipos e imágenes de la interfaz.</w:t>
+      </w:r>
+    </w:p>
     <w:p>
       <w:pPr>
         <w:pStyle w:val="Heading1"/>
@@ -1043,30 +158,12 @@
     <w:p>
       <w:r>
         <w:t>El estado isLoggedIn controla la transición entre el login y ExploreView. La función getEmailStatus valida el dominio institucional. handleSubmit valida campos, simula una espera de carga de 1.8 segundos y compara las credenciales de demostración.</w:t>
-      </w:r>
-    </w:p>
-    <w:p>
-      <w:pPr>
-        <w:pStyle w:val="ListBullet"/>
-      </w:pPr>
-      <w:r>
-        <w:t>Dominio permitido: @unison.mx.</w:t>
-      </w:r>
-    </w:p>
-    <w:p>
-      <w:pPr>
-        <w:pStyle w:val="ListBullet"/>
-      </w:pPr>
-      <w:r>
-        <w:t>Credenciales de demostración: usuario@unison.mx / 123456.</w:t>
-      </w:r>
-    </w:p>
-    <w:p>
-      <w:pPr>
-        <w:pStyle w:val="ListBullet"/>
-      </w:pPr>
-      <w:r>
-        <w:t>No existe autenticación real, tokens, sesiones persistentes ni conexión a backend.</w:t>
+        <w:br/>
+        <w:t>- Dominio permitido: @unison.mx.</w:t>
+        <w:br/>
+        <w:t>- Credenciales de demostración: usuario@unison.mx / 123456.</w:t>
+        <w:br/>
+        <w:t>- No existe autenticación real, tokens, sesiones persistentes ni conexión a backend.</w:t>
       </w:r>
     </w:p>
     <w:p>
@@ -1091,43 +188,16 @@
       </w:r>
     </w:p>
     <w:p>
-      <w:pPr>
-        <w:pStyle w:val="ListBullet"/>
-      </w:pPr>
       <w:r>
-        <w:t>El login ocupa el viewport y oculta el desbordamiento vertical en escritorio.</w:t>
-      </w:r>
-    </w:p>
-    <w:p>
-      <w:pPr>
-        <w:pStyle w:val="ListBullet"/>
-      </w:pPr>
-      <w:r>
-        <w:t>En móvil se oculta la imagen lateral y el formulario pasa a una sola columna.</w:t>
-      </w:r>
-    </w:p>
-    <w:p>
-      <w:pPr>
-        <w:pStyle w:val="ListBullet"/>
-      </w:pPr>
-      <w:r>
-        <w:t>La sidebar y los controles de búsqueda reducen su tamaño en pantallas pequeñas.</w:t>
-      </w:r>
-    </w:p>
-    <w:p>
-      <w:pPr>
-        <w:pStyle w:val="ListBullet"/>
-      </w:pPr>
-      <w:r>
-        <w:t>Los modales se ajustan al ancho disponible y el detalle pasa de dos columnas a una.</w:t>
-      </w:r>
-    </w:p>
-    <w:p>
-      <w:pPr>
-        <w:pStyle w:val="ListBullet"/>
-      </w:pPr>
-      <w:r>
-        <w:t>index.css evita el desbordamiento horizontal global.</w:t>
+        <w:t>- El login ocupa el viewport y oculta el desbordamiento vertical en escritorio.</w:t>
+        <w:br/>
+        <w:t>- En móvil se oculta la imagen lateral y el formulario pasa a una sola columna.</w:t>
+        <w:br/>
+        <w:t>- La sidebar y los controles de búsqueda reducen su tamaño en pantallas pequeñas.</w:t>
+        <w:br/>
+        <w:t>- Los modales se ajustan al ancho disponible y el detalle pasa de dos columnas a una.</w:t>
+        <w:br/>
+        <w:t>- index.css evita el desbordamiento horizontal global.</w:t>
       </w:r>
     </w:p>
     <w:p>
@@ -1138,188 +208,17 @@
         <w:t>10. Verificación actual</w:t>
       </w:r>
     </w:p>
-    <w:tbl>
-      <w:tblPr>
-        <w:tblStyle w:val="TableGrid"/>
-        <w:tblW w:type="auto" w:w="0"/>
-        <w:jc w:val="center"/>
-        <w:tblLook w:firstColumn="1" w:firstRow="1" w:lastColumn="0" w:lastRow="0" w:noHBand="0" w:noVBand="1" w:val="04A0"/>
-      </w:tblPr>
-      <w:tblGrid>
-        <w:gridCol w:w="4968"/>
-        <w:gridCol w:w="4968"/>
-      </w:tblGrid>
-      <w:tr>
-        <w:tc>
-          <w:tcPr>
-            <w:tcW w:type="dxa" w:w="4968"/>
-            <w:vAlign w:val="center"/>
-            <w:shd w:fill="2F5496"/>
-          </w:tcPr>
-          <w:p>
-            <w:r/>
-            <w:r>
-              <w:rPr>
-                <w:b/>
-                <w:color w:val="FFFFFF"/>
-                <w:sz w:val="18"/>
-              </w:rPr>
-              <w:t>Verificación</w:t>
-            </w:r>
-          </w:p>
-        </w:tc>
-        <w:tc>
-          <w:tcPr>
-            <w:tcW w:type="dxa" w:w="4968"/>
-            <w:vAlign w:val="center"/>
-            <w:shd w:fill="2F5496"/>
-          </w:tcPr>
-          <w:p>
-            <w:r/>
-            <w:r>
-              <w:rPr>
-                <w:b/>
-                <w:color w:val="FFFFFF"/>
-                <w:sz w:val="18"/>
-              </w:rPr>
-              <w:t>Resultado</w:t>
-            </w:r>
-          </w:p>
-        </w:tc>
-      </w:tr>
-      <w:tr>
-        <w:tc>
-          <w:tcPr>
-            <w:tcW w:type="dxa" w:w="4968"/>
-            <w:vAlign w:val="center"/>
-          </w:tcPr>
-          <w:p>
-            <w:r/>
-            <w:r>
-              <w:rPr>
-                <w:b w:val="0"/>
-                <w:sz w:val="18"/>
-              </w:rPr>
-              <w:t>npm run build</w:t>
-            </w:r>
-          </w:p>
-        </w:tc>
-        <w:tc>
-          <w:tcPr>
-            <w:tcW w:type="dxa" w:w="4968"/>
-            <w:vAlign w:val="center"/>
-          </w:tcPr>
-          <w:p>
-            <w:r>
-              <w:t>Correcto; compilación de producción generada.</w:t>
-            </w:r>
-          </w:p>
-        </w:tc>
-      </w:tr>
-      <w:tr>
-        <w:tc>
-          <w:tcPr>
-            <w:tcW w:type="dxa" w:w="4968"/>
-            <w:vAlign w:val="center"/>
-          </w:tcPr>
-          <w:p>
-            <w:r/>
-            <w:r>
-              <w:rPr>
-                <w:b w:val="0"/>
-                <w:sz w:val="18"/>
-              </w:rPr>
-              <w:t>npm run lint</w:t>
-            </w:r>
-          </w:p>
-        </w:tc>
-        <w:tc>
-          <w:tcPr>
-            <w:tcW w:type="dxa" w:w="4968"/>
-            <w:vAlign w:val="center"/>
-          </w:tcPr>
-          <w:p>
-            <w:r/>
-            <w:r>
-              <w:rPr>
-                <w:b w:val="0"/>
-                <w:sz w:val="18"/>
-              </w:rPr>
-              <w:t>Correcto; sin errores de ESLint.</w:t>
-            </w:r>
-          </w:p>
-        </w:tc>
-      </w:tr>
-      <w:tr>
-        <w:tc>
-          <w:tcPr>
-            <w:tcW w:type="dxa" w:w="4968"/>
-            <w:vAlign w:val="center"/>
-          </w:tcPr>
-          <w:p>
-            <w:r/>
-            <w:r>
-              <w:rPr>
-                <w:b w:val="0"/>
-                <w:sz w:val="18"/>
-              </w:rPr>
-              <w:t>Rama publicada</w:t>
-            </w:r>
-          </w:p>
-        </w:tc>
-        <w:tc>
-          <w:tcPr>
-            <w:tcW w:type="dxa" w:w="4968"/>
-            <w:vAlign w:val="center"/>
-          </w:tcPr>
-          <w:p>
-            <w:r/>
-            <w:r>
-              <w:rPr>
-                <w:b w:val="0"/>
-                <w:sz w:val="18"/>
-              </w:rPr>
-              <w:t>main</w:t>
-            </w:r>
-          </w:p>
-        </w:tc>
-      </w:tr>
-      <w:tr>
-        <w:tc>
-          <w:tcPr>
-            <w:tcW w:type="dxa" w:w="4968"/>
-            <w:vAlign w:val="center"/>
-          </w:tcPr>
-          <w:p>
-            <w:r/>
-            <w:r>
-              <w:rPr>
-                <w:b w:val="0"/>
-                <w:sz w:val="18"/>
-              </w:rPr>
-              <w:t>Repositorio</w:t>
-            </w:r>
-          </w:p>
-        </w:tc>
-        <w:tc>
-          <w:tcPr>
-            <w:tcW w:type="dxa" w:w="4968"/>
-            <w:vAlign w:val="center"/>
-          </w:tcPr>
-          <w:p>
-            <w:r/>
-            <w:r>
-              <w:rPr>
-                <w:b w:val="0"/>
-                <w:sz w:val="18"/>
-              </w:rPr>
-              <w:t>https://github.com/Sapitoequisde/Olwe_prototipo</w:t>
-            </w:r>
-          </w:p>
-        </w:tc>
-      </w:tr>
-    </w:tbl>
-    <w:p/>
+    <w:p>
+      <w:r>
+        <w:t>- npm run build: Correcto; compilación de producción generada.</w:t>
+        <w:br/>
+        <w:t>- npm run lint: Correcto; sin errores de ESLint.</w:t>
+        <w:br/>
+        <w:t>- Rama publicada: main</w:t>
+        <w:br/>
+        <w:t>- Repositorio: https://github.com/Sapitoequisde/Olwe_prototipo</w:t>
+      </w:r>
+    </w:p>
     <w:p>
       <w:pPr>
         <w:pStyle w:val="Heading1"/>
@@ -1342,72 +241,26 @@
       </w:r>
     </w:p>
     <w:p>
-      <w:pPr>
-        <w:pStyle w:val="ListBullet"/>
-      </w:pPr>
       <w:r>
-        <w:t>Conectar autenticación real y recuperación de contraseña.</w:t>
-      </w:r>
-    </w:p>
-    <w:p>
-      <w:pPr>
-        <w:pStyle w:val="ListBullet"/>
-      </w:pPr>
-      <w:r>
-        <w:t>Persistir planes en una API y base de datos.</w:t>
-      </w:r>
-    </w:p>
-    <w:p>
-      <w:pPr>
-        <w:pStyle w:val="ListBullet"/>
-      </w:pPr>
-      <w:r>
-        <w:t>Implementar notificaciones, eventos inscritos, chats y perfil.</w:t>
-      </w:r>
-    </w:p>
-    <w:p>
-      <w:pPr>
-        <w:pStyle w:val="ListBullet"/>
-      </w:pPr>
-      <w:r>
-        <w:t>Agregar pruebas automatizadas de componentes y flujos.</w:t>
-      </w:r>
-    </w:p>
-    <w:p>
-      <w:pPr>
-        <w:pStyle w:val="ListBullet"/>
-      </w:pPr>
-      <w:r>
-        <w:t>Configurar variables de entorno y una estrategia de despliegue permanente.</w:t>
+        <w:t>- Conectar autenticación real y recuperación de contraseña.</w:t>
+        <w:br/>
+        <w:t>- Persistir planes en una API y base de datos.</w:t>
+        <w:br/>
+        <w:t>- Implementar notificaciones, eventos inscritos, chats y perfil.</w:t>
+        <w:br/>
+        <w:t>- Agregar pruebas automatizadas de componentes y flujos.</w:t>
+        <w:br/>
+        <w:t>- Configurar variables de entorno y una estrategia de despliegue permanente.</w:t>
       </w:r>
     </w:p>
     <w:sectPr>
-      <w:footerReference w:type="default" r:id="rId9"/>
       <w:pgSz w:w="12240" w:h="15840"/>
-      <w:pgMar w:top="1008" w:right="1152" w:bottom="1008" w:left="1152" w:header="720" w:footer="720" w:gutter="0"/>
+      <w:pgMar w:top="1440" w:right="1800" w:bottom="1440" w:left="1800" w:header="720" w:footer="720" w:gutter="0"/>
       <w:cols w:space="720"/>
       <w:docGrid w:linePitch="360"/>
     </w:sectPr>
   </w:body>
 </w:document>
-</file>
-
-<file path=word/footer1.xml><?xml version="1.0" encoding="utf-8"?>
-<w:ftr xmlns:m="http://schemas.openxmlformats.org/officeDocument/2006/math" xmlns:mc="http://schemas.openxmlformats.org/markup-compatibility/2006" xmlns:mo="http://schemas.microsoft.com/office/mac/office/2008/main" xmlns:mv="urn:schemas-microsoft-com:mac:vml" xmlns:o="urn:schemas-microsoft-com:office:office" xmlns:r="http://schemas.openxmlformats.org/officeDocument/2006/relationships" xmlns:v="urn:schemas-microsoft-com:vml" xmlns:w10="urn:schemas-microsoft-com:office:word" xmlns:w14="http://schemas.microsoft.com/office/word/2010/wordml" xmlns:w="http://schemas.openxmlformats.org/wordprocessingml/2006/main" xmlns:wne="http://schemas.microsoft.com/office/word/2006/wordml" xmlns:wp14="http://schemas.microsoft.com/office/word/2010/wordprocessingDrawing" xmlns:wp="http://schemas.openxmlformats.org/drawingml/2006/wordprocessingDrawing" xmlns:wpc="http://schemas.microsoft.com/office/word/2010/wordprocessingCanvas" xmlns:wpg="http://schemas.microsoft.com/office/word/2010/wordprocessingGroup" xmlns:wpi="http://schemas.microsoft.com/office/word/2010/wordprocessingInk" xmlns:wps="http://schemas.microsoft.com/office/word/2010/wordprocessingShape" mc:Ignorable="w14 wp14">
-  <w:p>
-    <w:pPr>
-      <w:pStyle w:val="Footer"/>
-      <w:jc w:val="center"/>
-    </w:pPr>
-    <w:r>
-      <w:rPr>
-        <w:color w:val="595959"/>
-        <w:sz w:val="16"/>
-      </w:rPr>
-      <w:t>Olwe - Sistema web universitario | Documentaci?n generada el 22 de septiembre de 2026</w:t>
-    </w:r>
-  </w:p>
-</w:ftr>
 </file>
 
 <file path=word/numbering.xml><?xml version="1.0" encoding="utf-8"?>
@@ -1773,11 +626,6 @@
     <w:name w:val="Normal"/>
     <w:qFormat/>
     <w:rsid w:val="00FC693F"/>
-    <w:rPr>
-      <w:rFonts w:ascii="Aptos" w:hAnsi="Aptos"/>
-      <w:color w:val="2D2D2D"/>
-      <w:sz w:val="20"/>
-    </w:rPr>
   </w:style>
   <w:style w:type="paragraph" w:styleId="Header">
     <w:name w:val="header"/>
@@ -1838,11 +686,11 @@
       <w:outlineLvl w:val="0"/>
     </w:pPr>
     <w:rPr>
-      <w:rFonts w:asciiTheme="majorHAnsi" w:eastAsiaTheme="majorEastAsia" w:hAnsiTheme="majorHAnsi" w:cstheme="majorBidi" w:ascii="Aptos Display" w:hAnsi="Aptos Display"/>
+      <w:rFonts w:asciiTheme="majorHAnsi" w:eastAsiaTheme="majorEastAsia" w:hAnsiTheme="majorHAnsi" w:cstheme="majorBidi"/>
       <w:b/>
       <w:bCs/>
-      <w:color w:val="1F3864"/>
-      <w:sz w:val="32"/>
+      <w:color w:val="365F91" w:themeColor="accent1" w:themeShade="BF"/>
+      <w:sz w:val="28"/>
       <w:szCs w:val="28"/>
     </w:rPr>
   </w:style>
@@ -1862,10 +710,10 @@
       <w:outlineLvl w:val="1"/>
     </w:pPr>
     <w:rPr>
-      <w:rFonts w:asciiTheme="majorHAnsi" w:eastAsiaTheme="majorEastAsia" w:hAnsiTheme="majorHAnsi" w:cstheme="majorBidi" w:ascii="Aptos Display" w:hAnsi="Aptos Display"/>
+      <w:rFonts w:asciiTheme="majorHAnsi" w:eastAsiaTheme="majorEastAsia" w:hAnsiTheme="majorHAnsi" w:cstheme="majorBidi"/>
       <w:b/>
       <w:bCs/>
-      <w:color w:val="2F5496"/>
+      <w:color w:val="4F81BD" w:themeColor="accent1"/>
       <w:sz w:val="26"/>
       <w:szCs w:val="26"/>
     </w:rPr>
@@ -1886,11 +734,10 @@
       <w:outlineLvl w:val="2"/>
     </w:pPr>
     <w:rPr>
-      <w:rFonts w:asciiTheme="majorHAnsi" w:eastAsiaTheme="majorEastAsia" w:hAnsiTheme="majorHAnsi" w:cstheme="majorBidi" w:ascii="Aptos Display" w:hAnsi="Aptos Display"/>
+      <w:rFonts w:asciiTheme="majorHAnsi" w:eastAsiaTheme="majorEastAsia" w:hAnsiTheme="majorHAnsi" w:cstheme="majorBidi"/>
       <w:b/>
       <w:bCs/>
-      <w:color w:val="2F5496"/>
-      <w:sz w:val="22"/>
+      <w:color w:val="4F81BD" w:themeColor="accent1"/>
     </w:rPr>
   </w:style>
   <w:style w:type="paragraph" w:styleId="Heading4">
@@ -2128,12 +975,11 @@
       <w:contextualSpacing/>
     </w:pPr>
     <w:rPr>
-      <w:rFonts w:asciiTheme="majorHAnsi" w:eastAsiaTheme="majorEastAsia" w:hAnsiTheme="majorHAnsi" w:cstheme="majorBidi" w:ascii="Aptos Display" w:hAnsi="Aptos Display"/>
-      <w:b/>
-      <w:color w:val="1F3864"/>
+      <w:rFonts w:asciiTheme="majorHAnsi" w:eastAsiaTheme="majorEastAsia" w:hAnsiTheme="majorHAnsi" w:cstheme="majorBidi"/>
+      <w:color w:val="17365D" w:themeColor="text2" w:themeShade="BF"/>
       <w:spacing w:val="5"/>
       <w:kern w:val="28"/>
-      <w:sz w:val="48"/>
+      <w:sz w:val="52"/>
       <w:szCs w:val="52"/>
     </w:rPr>
   </w:style>

</xml_diff>